<commit_message>
Site update: AI repositioning, lead magnet, guides page, accessibility, privacy and terms, plural copy
</commit_message>
<xml_diff>
--- a/docs/manychat_setup_guide.docx
+++ b/docs/manychat_setup_guide.docx
@@ -767,7 +767,7 @@
           <w:sz w:val="24"/>
           <w:szCs w:val="24"/>
         </w:rPr>
-        <w:t xml:space="preserve">גש לאתר manychat.com ולחץ על "Get Started Free"</w:t>
+        <w:t>גשו לאתר manychat.com ולחצו על "Get Started Free"</w:t>
       </w:r>
     </w:p>
     <w:p>
@@ -785,7 +785,7 @@
           <w:sz w:val="24"/>
           <w:szCs w:val="24"/>
         </w:rPr>
-        <w:t xml:space="preserve">בחר "Sign up with Facebook" (חשוב — חובה לחבר דרך Facebook)</w:t>
+        <w:t>בחרו "Sign up with Facebook" (חשוב — חובה לחבר דרך Facebook)</w:t>
       </w:r>
     </w:p>
     <w:p>
@@ -803,7 +803,7 @@
           <w:sz w:val="24"/>
           <w:szCs w:val="24"/>
         </w:rPr>
-        <w:t xml:space="preserve">אשר את ההרשאות ש-Facebook מבקש</w:t>
+        <w:t>אשרו את ההרשאות ש-Facebook מבקש</w:t>
       </w:r>
     </w:p>
     <w:p>
@@ -821,7 +821,7 @@
           <w:sz w:val="24"/>
           <w:szCs w:val="24"/>
         </w:rPr>
-        <w:t xml:space="preserve">בחר את עמוד ה-Facebook שמחובר לחשבון ה-Instagram שלך</w:t>
+        <w:t>בחרו את עמוד ה-Facebook שמחובר לחשבון ה-Instagram שלך</w:t>
       </w:r>
     </w:p>
     <w:p>
@@ -839,7 +839,7 @@
           <w:sz w:val="24"/>
           <w:szCs w:val="24"/>
         </w:rPr>
-        <w:t xml:space="preserve">לחץ "Connect" — המערכת תבקש אישור נוסף</w:t>
+        <w:t>לחצו "Connect" — המערכת תבקש אישור נוסף</w:t>
       </w:r>
     </w:p>
     <w:p>
@@ -926,7 +926,7 @@
                 <w:sz w:val="22"/>
                 <w:szCs w:val="22"/>
               </w:rPr>
-              <w:t xml:space="preserve">וודאי שיש לך חשבון Instagram Business (לא אישי)</w:t>
+              <w:t>וודאו שיש לך חשבון Instagram Business (לא אישי)</w:t>
             </w:r>
           </w:p>
         </w:tc>
@@ -958,7 +958,7 @@
                 <w:sz w:val="22"/>
                 <w:szCs w:val="22"/>
               </w:rPr>
-              <w:t xml:space="preserve">וודאי שעמוד ה-Facebook שלך מחובר לחשבון ה-Instagram</w:t>
+              <w:t>וודאו שעמוד ה-Facebook שלך מחובר לחשבון ה-Instagram</w:t>
             </w:r>
           </w:p>
         </w:tc>
@@ -1065,7 +1065,7 @@
           <w:sz w:val="24"/>
           <w:szCs w:val="24"/>
         </w:rPr>
-        <w:t xml:space="preserve">בתוך ManyChat לחצי על Settings (הגדרות) בתפריט השמאלי</w:t>
+        <w:t>בתוך ManyChat לחצו על Settings (הגדרות) בתפריט השמאלי</w:t>
       </w:r>
     </w:p>
     <w:p>
@@ -1083,7 +1083,7 @@
           <w:sz w:val="24"/>
           <w:szCs w:val="24"/>
         </w:rPr>
-        <w:t xml:space="preserve">בחרי Instagram</w:t>
+        <w:t>בחרו Instagram</w:t>
       </w:r>
     </w:p>
     <w:p>
@@ -1101,7 +1101,7 @@
           <w:sz w:val="24"/>
           <w:szCs w:val="24"/>
         </w:rPr>
-        <w:t xml:space="preserve">לחצי Connect Instagram Account</w:t>
+        <w:t>לחצו Connect Instagram Account</w:t>
       </w:r>
     </w:p>
     <w:p>
@@ -1119,7 +1119,7 @@
           <w:sz w:val="24"/>
           <w:szCs w:val="24"/>
         </w:rPr>
-        <w:t xml:space="preserve">התחברי לחשבון הפייסבוק שמחובר ל-@shani.creates.ai</w:t>
+        <w:t>התחברו לחשבון הפייסבוק שמחובר ל-@shani.creates.ai</w:t>
       </w:r>
     </w:p>
     <w:p>
@@ -1137,7 +1137,7 @@
           <w:sz w:val="24"/>
           <w:szCs w:val="24"/>
         </w:rPr>
-        <w:t xml:space="preserve">בחרי את הפרופיל @shani.creates.ai מהרשימה</w:t>
+        <w:t>בחרו את הפרופיל @shani.creates.ai מהרשימה</w:t>
       </w:r>
     </w:p>
     <w:p>
@@ -1155,7 +1155,7 @@
           <w:sz w:val="24"/>
           <w:szCs w:val="24"/>
         </w:rPr>
-        <w:t xml:space="preserve">אשרי את כל ההרשאות שמבקש ManyChat (DM, Comments, Mentions)</w:t>
+        <w:t>אשרו את כל ההרשאות שמבקש ManyChat (DM, Comments, Mentions)</w:t>
       </w:r>
     </w:p>
     <w:p>
@@ -1242,7 +1242,7 @@
                 <w:sz w:val="22"/>
                 <w:szCs w:val="22"/>
               </w:rPr>
-              <w:t xml:space="preserve">בדקי שה-Instagram מוגדר כ-Business/Creator</w:t>
+              <w:t>בדקו שה-Instagram מוגדר כ-Business/Creator</w:t>
             </w:r>
           </w:p>
         </w:tc>
@@ -1274,7 +1274,7 @@
                 <w:sz w:val="22"/>
                 <w:szCs w:val="22"/>
               </w:rPr>
-              <w:t xml:space="preserve">בדקי שהחשבון מחובר לעמוד הפייסבוק הנכון</w:t>
+              <w:t>בדקו שהחשבון מחובר לעמוד הפייסבוק הנכון</w:t>
             </w:r>
           </w:p>
         </w:tc>
@@ -1306,7 +1306,7 @@
                 <w:sz w:val="22"/>
                 <w:szCs w:val="22"/>
               </w:rPr>
-              <w:t xml:space="preserve">נסי מחדש דרך: Facebook &gt; Settings &gt; Instagram &gt; Connected Accounts</w:t>
+              <w:t>נסו מחדש דרך: Facebook &gt; Settings &gt; Instagram &gt; Connected Accounts</w:t>
             </w:r>
           </w:p>
         </w:tc>
@@ -1403,7 +1403,7 @@
           <w:sz w:val="24"/>
           <w:szCs w:val="24"/>
         </w:rPr>
-        <w:t xml:space="preserve">בתפריט המרכזי לחצי Automation &gt; Flows</w:t>
+        <w:t>בתפריט המרכזי לחצו Automation &gt; Flows</w:t>
       </w:r>
     </w:p>
     <w:p>
@@ -1421,7 +1421,7 @@
           <w:sz w:val="24"/>
           <w:szCs w:val="24"/>
         </w:rPr>
-        <w:t xml:space="preserve">לחצי + New Flow (כפתור כחול בפינה הימנית העליונה)</w:t>
+        <w:t>לחצו + New Flow (כפתור כחול בפינה הימנית העליונה)</w:t>
       </w:r>
     </w:p>
     <w:p>
@@ -1439,7 +1439,7 @@
           <w:sz w:val="24"/>
           <w:szCs w:val="24"/>
         </w:rPr>
-        <w:t xml:space="preserve">בחרי Start from Scratch</w:t>
+        <w:t>בחרו Start from Scratch</w:t>
       </w:r>
     </w:p>
     <w:p>
@@ -1457,7 +1457,7 @@
           <w:sz w:val="24"/>
           <w:szCs w:val="24"/>
         </w:rPr>
-        <w:t xml:space="preserve">תני שם ל-Flow: CLAUDE Keyword Flow</w:t>
+        <w:t>תנו שם ל-Flow: CLAUDE Keyword Flow</w:t>
       </w:r>
     </w:p>
     <w:p>
@@ -1475,7 +1475,7 @@
           <w:sz w:val="24"/>
           <w:szCs w:val="24"/>
         </w:rPr>
-        <w:t xml:space="preserve">לחצי Create</w:t>
+        <w:t>לחצו Create</w:t>
       </w:r>
     </w:p>
     <w:p>
@@ -1523,7 +1523,7 @@
           <w:sz w:val="24"/>
           <w:szCs w:val="24"/>
         </w:rPr>
-        <w:t xml:space="preserve">בתוך ה-Flow לחצי על + Add Trigger</w:t>
+        <w:t>בתוך ה-Flow לחצו על + Add Trigger</w:t>
       </w:r>
     </w:p>
     <w:p>
@@ -1541,7 +1541,7 @@
           <w:sz w:val="24"/>
           <w:szCs w:val="24"/>
         </w:rPr>
-        <w:t xml:space="preserve">בחרי Instagram &gt; Comment (Keyword)</w:t>
+        <w:t>בחרו Instagram &gt; Comment (Keyword)</w:t>
       </w:r>
     </w:p>
     <w:p>
@@ -1559,7 +1559,7 @@
           <w:sz w:val="24"/>
           <w:szCs w:val="24"/>
         </w:rPr>
-        <w:t xml:space="preserve">בשדה Keywords הקלידי: CLAUDE</w:t>
+        <w:t>בשדה Keywords הקלידו: CLAUDE</w:t>
       </w:r>
     </w:p>
     <w:p>
@@ -1577,7 +1577,7 @@
           <w:sz w:val="24"/>
           <w:szCs w:val="24"/>
         </w:rPr>
-        <w:t xml:space="preserve">וודאי שה-Match Type מוגדר ל-Is (מילה מדויקת) ולא Contains</w:t>
+        <w:t>וודאו שה-Match Type מוגדר ל-Is (מילה מדויקת) ולא Contains</w:t>
       </w:r>
     </w:p>
     <w:p>
@@ -1595,7 +1595,7 @@
           <w:sz w:val="24"/>
           <w:szCs w:val="24"/>
         </w:rPr>
-        <w:t xml:space="preserve">לחצי Save</w:t>
+        <w:t>לחצו Save</w:t>
       </w:r>
     </w:p>
     <w:p>
@@ -1746,7 +1746,7 @@
                 <w:sz w:val="22"/>
                 <w:szCs w:val="22"/>
               </w:rPr>
-              <w:t xml:space="preserve">המלצה: השתמשי ב-Is למניעת תגובות זבל</w:t>
+              <w:t>המלצה: השתמשו ב-Is למניעת תגובות זבל</w:t>
             </w:r>
           </w:p>
         </w:tc>
@@ -1847,7 +1847,7 @@
           <w:sz w:val="24"/>
           <w:szCs w:val="24"/>
         </w:rPr>
-        <w:t xml:space="preserve">ב-Flow Builder לחצי על + Add Action</w:t>
+        <w:t>ב-Flow Builder לחצו על + Add Action</w:t>
       </w:r>
     </w:p>
     <w:p>
@@ -1865,7 +1865,7 @@
           <w:sz w:val="24"/>
           <w:szCs w:val="24"/>
         </w:rPr>
-        <w:t xml:space="preserve">בחרי Condition</w:t>
+        <w:t>בחרו Condition</w:t>
       </w:r>
     </w:p>
     <w:p>
@@ -1883,7 +1883,7 @@
           <w:sz w:val="24"/>
           <w:szCs w:val="24"/>
         </w:rPr>
-        <w:t xml:space="preserve">בחרי Check if user is following</w:t>
+        <w:t>בחרו Check if user is following</w:t>
       </w:r>
     </w:p>
     <w:p>
@@ -1901,7 +1901,7 @@
           <w:sz w:val="24"/>
           <w:szCs w:val="24"/>
         </w:rPr>
-        <w:t xml:space="preserve">בענף YES (עוקב): המשיכי לשלב שליחת ה-DM</w:t>
+        <w:t>בענף YES (עוקב): המשיכו לשלב שליחת ה-DM</w:t>
       </w:r>
     </w:p>
     <w:p>
@@ -1919,7 +1919,7 @@
           <w:sz w:val="24"/>
           <w:szCs w:val="24"/>
         </w:rPr>
-        <w:t xml:space="preserve">בענף NO (לא עוקב): הוסיפי Send Message:</w:t>
+        <w:t>בענף NO (לא עוקב): הוסיפו Send Message:</w:t>
       </w:r>
     </w:p>
     <w:p>
@@ -1988,7 +1988,7 @@
                 <w:sz w:val="22"/>
                 <w:szCs w:val="22"/>
               </w:rPr>
-              <w:t xml:space="preserve">"היי! כדי לקבל את המדריך — עקבי אחרי @shani.creates.ai</w:t>
+              <w:t>"היי! כדי לקבל את המדריך — עקבו אחרי @shani.creates.ai</w:t>
             </w:r>
           </w:p>
           <w:p>
@@ -2002,7 +2002,7 @@
                 <w:sz w:val="22"/>
                 <w:szCs w:val="22"/>
               </w:rPr>
-              <w:t xml:space="preserve"> ואז הגיבי CLAUDE שוב על הפוסט :)"</w:t>
+              <w:t xml:space="preserve"> ואז הגיבו CLAUDE שוב על הפוסט :)"</w:t>
             </w:r>
           </w:p>
         </w:tc>
@@ -2053,7 +2053,7 @@
           <w:sz w:val="24"/>
           <w:szCs w:val="24"/>
         </w:rPr>
-        <w:t xml:space="preserve">בענף YES לחצי + Add Action &gt; Send Message</w:t>
+        <w:t>בענף YES לחצו + Add Action &gt; Send Message</w:t>
       </w:r>
     </w:p>
     <w:p>
@@ -2071,7 +2071,7 @@
           <w:sz w:val="24"/>
           <w:szCs w:val="24"/>
         </w:rPr>
-        <w:t xml:space="preserve">בחרי Direct Message</w:t>
+        <w:t>בחרו Direct Message</w:t>
       </w:r>
     </w:p>
     <w:p>
@@ -2304,7 +2304,7 @@
                 <w:sz w:val="22"/>
                 <w:szCs w:val="22"/>
               </w:rPr>
-              <w:t xml:space="preserve">בשדה ה-DM לחצי על כפתור הקישור (שרשרת)</w:t>
+              <w:t>בשדה ה-DM לחצו על כפתור הקישור (שרשרת)</w:t>
             </w:r>
           </w:p>
         </w:tc>
@@ -2336,7 +2336,7 @@
                 <w:sz w:val="22"/>
                 <w:szCs w:val="22"/>
               </w:rPr>
-              <w:t xml:space="preserve">הדביקי את הקישור המלא למדריך</w:t>
+              <w:t>הדביקו את הקישור המלא למדריך</w:t>
             </w:r>
           </w:p>
         </w:tc>
@@ -2475,7 +2475,7 @@
           <w:sz w:val="24"/>
           <w:szCs w:val="24"/>
         </w:rPr>
-        <w:t xml:space="preserve">פרסמי את הפוסט ב-Instagram עם הנחיה ברורה (ראי דוגמאות בחלק ה)</w:t>
+        <w:t>פרסמו את הפוסט ב-Instagram עם הנחיה ברורה (ראו דוגמאות בחלק ה)</w:t>
       </w:r>
     </w:p>
     <w:p>
@@ -2493,7 +2493,7 @@
           <w:sz w:val="24"/>
           <w:szCs w:val="24"/>
         </w:rPr>
-        <w:t xml:space="preserve">ב-ManyChat לכי ל-Automation &gt; Comment Growth Tool</w:t>
+        <w:t>ב-ManyChat לכו ל-Automation &gt; Comment Growth Tool</w:t>
       </w:r>
     </w:p>
     <w:p>
@@ -2511,7 +2511,7 @@
           <w:sz w:val="24"/>
           <w:szCs w:val="24"/>
         </w:rPr>
-        <w:t xml:space="preserve">לחצי + Add Post</w:t>
+        <w:t>לחצו + Add Post</w:t>
       </w:r>
     </w:p>
     <w:p>
@@ -2529,7 +2529,7 @@
           <w:sz w:val="24"/>
           <w:szCs w:val="24"/>
         </w:rPr>
-        <w:t xml:space="preserve">בחרי את הפוסט הרלוונטי מהרשימה</w:t>
+        <w:t>בחרו את הפוסט הרלוונטי מהרשימה</w:t>
       </w:r>
     </w:p>
     <w:p>
@@ -2547,7 +2547,7 @@
           <w:sz w:val="24"/>
           <w:szCs w:val="24"/>
         </w:rPr>
-        <w:t xml:space="preserve">חברי אותו ל-Flow שיצרת: CLAUDE Keyword Flow</w:t>
+        <w:t>חברו אותו ל-Flow שיצרת: CLAUDE Keyword Flow</w:t>
       </w:r>
     </w:p>
     <w:p>
@@ -2565,7 +2565,7 @@
           <w:sz w:val="24"/>
           <w:szCs w:val="24"/>
         </w:rPr>
-        <w:t xml:space="preserve">וודאי שהמצב Active</w:t>
+        <w:t>וודאו שהמצב Active</w:t>
       </w:r>
     </w:p>
     <w:p>
@@ -2613,7 +2613,7 @@
           <w:sz w:val="24"/>
           <w:szCs w:val="24"/>
         </w:rPr>
-        <w:t xml:space="preserve">חזרי על אותם השלבים בדיוק מחלק ב, עם השינויים הבאים:</w:t>
+        <w:t>חזרו על אותם השלבים בדיוק מחלק ב, עם השינויים הבאים:</w:t>
       </w:r>
     </w:p>
     <w:p>
@@ -3003,7 +3003,7 @@
                 <w:sz w:val="22"/>
                 <w:szCs w:val="22"/>
               </w:rPr>
-              <w:t xml:space="preserve">תוכן ה-DM (העתיקי והדביקי ישירות):</w:t>
+              <w:t>תוכן ה-DM (העתיקו והדביקו ישירות):</w:t>
             </w:r>
           </w:p>
           <w:p>
@@ -3073,7 +3073,7 @@
                 <w:sz w:val="22"/>
                 <w:szCs w:val="22"/>
               </w:rPr>
-              <w:t xml:space="preserve">30 שניות להתקנה ואת בפנים</w:t>
+              <w:t>30 שניות להתקנה ואתם בפנים</w:t>
             </w:r>
           </w:p>
           <w:p>
@@ -3173,7 +3173,7 @@
                 <w:sz w:val="22"/>
                 <w:szCs w:val="22"/>
               </w:rPr>
-              <w:t xml:space="preserve">"היי! כדי לקבל את הסקיל — עקבי אחרי @shani.creates.ai</w:t>
+              <w:t>"היי! כדי לקבל את הסקיל — עקבו אחרי @shani.creates.ai</w:t>
             </w:r>
           </w:p>
           <w:p>
@@ -3187,7 +3187,7 @@
                 <w:sz w:val="22"/>
                 <w:szCs w:val="22"/>
               </w:rPr>
-              <w:t xml:space="preserve"> ואז הגיבי RTL שוב על הפוסט :)"</w:t>
+              <w:t xml:space="preserve"> ואז הגיבו RTL שוב על הפוסט :)"</w:t>
             </w:r>
           </w:p>
         </w:tc>
@@ -3347,7 +3347,7 @@
                 <w:sz w:val="22"/>
                 <w:szCs w:val="22"/>
               </w:rPr>
-              <w:t xml:space="preserve">רוצה ללמוד להשתמש ב-Claude Desktop?</w:t>
+              <w:t>רוצים ללמוד להשתמש ב-Claude Desktop?</w:t>
             </w:r>
           </w:p>
         </w:tc>
@@ -3411,7 +3411,7 @@
                 <w:sz w:val="22"/>
                 <w:szCs w:val="22"/>
               </w:rPr>
-              <w:t xml:space="preserve">כתבי CLAUDE בתגובות ותקבלי מאיתי מדריך שלם ישר ל-DM</w:t>
+              <w:t>כתבו CLAUDE בתגובות ותקבלו מאיתי מדריך שלם ישר ל-DM</w:t>
             </w:r>
           </w:p>
         </w:tc>
@@ -3685,7 +3685,7 @@
                 <w:sz w:val="22"/>
                 <w:szCs w:val="22"/>
               </w:rPr>
-              <w:t xml:space="preserve">כתבי CLAUDE בתגובות ותקבלי אותו ישר לאינבוקס</w:t>
+              <w:t>כתבו CLAUDE בתגובות ותקבלו אותו ישר לאינבוקס</w:t>
             </w:r>
           </w:p>
         </w:tc>
@@ -3885,7 +3885,7 @@
                 <w:sz w:val="22"/>
                 <w:szCs w:val="22"/>
               </w:rPr>
-              <w:t xml:space="preserve">כתבי RTL בתגובות וישלח לך ישר ל-DM</w:t>
+              <w:t>כתבו RTL בתגובות ויישלח לכם ישר ל-DM</w:t>
             </w:r>
           </w:p>
         </w:tc>
@@ -4095,7 +4095,7 @@
                 <w:sz w:val="22"/>
                 <w:szCs w:val="22"/>
               </w:rPr>
-              <w:t xml:space="preserve">כתבי RTL בתגובות לקבל ישר ל-DM</w:t>
+              <w:t>כתבו RTL בתגובות לקבל ישר ל-DM</w:t>
             </w:r>
           </w:p>
         </w:tc>
@@ -4170,7 +4170,7 @@
           <w:sz w:val="24"/>
           <w:szCs w:val="24"/>
         </w:rPr>
-        <w:t xml:space="preserve">כתבי את מילת המפתח באותיות גדולות (CLAUDE, RTL) — קל לזכור</w:t>
+        <w:t>כתבו את מילת המפתח באותיות גדולות (CLAUDE, RTL) — קל לזכור</w:t>
       </w:r>
     </w:p>
     <w:p>
@@ -4188,7 +4188,7 @@
           <w:sz w:val="24"/>
           <w:szCs w:val="24"/>
         </w:rPr>
-        <w:t xml:space="preserve">הוסיפי שורה: "המדריך/הסקיל ישלח אוטומטית ל-DM" — מנהל ציפיות</w:t>
+        <w:t>הוסיפו שורה: "המדריך/הסקיל ישלח אוטומטית ל-DM" — מנהל ציפיות</w:t>
       </w:r>
     </w:p>
     <w:p>
@@ -4206,7 +4206,7 @@
           <w:sz w:val="24"/>
           <w:szCs w:val="24"/>
         </w:rPr>
-        <w:t xml:space="preserve">אל תשכחי להוסיף קריאה לעקוב לפני הפרסום (Follow-gate)</w:t>
+        <w:t>אל תשכחו להוסיף קריאה לעקוב לפני הפרסום (Follow-gate)</w:t>
       </w:r>
     </w:p>
     <w:p>
@@ -4224,7 +4224,7 @@
           <w:sz w:val="24"/>
           <w:szCs w:val="24"/>
         </w:rPr>
-        <w:t xml:space="preserve">שימי הסברת הסרטון/תמונה בוידאו קצר — מגדיל מעורבות</w:t>
+        <w:t>שימו הסברת הסרטון/תמונה בוידאו קצר — מגדיל מעורבות</w:t>
       </w:r>
     </w:p>
     <w:p>
@@ -4242,7 +4242,7 @@
           <w:sz w:val="24"/>
           <w:szCs w:val="24"/>
         </w:rPr>
-        <w:t xml:space="preserve">פרסמי בשעות 19:00–22:00 בשעון ישראל — שיא מעורבות</w:t>
+        <w:t>פרסמו בשעות 19:00–22:00 בשעון ישראל — שיא מעורבות</w:t>
       </w:r>
     </w:p>
     <w:p>
@@ -4260,7 +4260,7 @@
           <w:sz w:val="24"/>
           <w:szCs w:val="24"/>
         </w:rPr>
-        <w:t xml:space="preserve">בדקי שה-Flow פעיל לפני הפרסום (Active = ירוק)</w:t>
+        <w:t>בדקו שה-Flow פעיל לפני הפרסום (Active = ירוק)</w:t>
       </w:r>
     </w:p>
     <w:p>
@@ -5397,7 +5397,7 @@
           <w:sz w:val="24"/>
           <w:szCs w:val="24"/>
         </w:rPr>
-        <w:t xml:space="preserve">כשתגיעי ל-900+ contacts (לפני שנתקעת)</w:t>
+        <w:t>כשתגיעו ל-900+ contacts (לפני שנתקעת)</w:t>
       </w:r>
     </w:p>
     <w:p>
@@ -5415,7 +5415,7 @@
           <w:sz w:val="24"/>
           <w:szCs w:val="24"/>
         </w:rPr>
-        <w:t xml:space="preserve">כשתרצי לשלוח Broadcast לכל הרשימה</w:t>
+        <w:t>כשתרצו לשלוח Broadcast לכל הרשימה</w:t>
       </w:r>
     </w:p>
     <w:p>
@@ -5433,7 +5433,7 @@
           <w:sz w:val="24"/>
           <w:szCs w:val="24"/>
         </w:rPr>
-        <w:t xml:space="preserve">כשתרצי לבנות סדרת הודעות אוטומטית (נרצ'ר)</w:t>
+        <w:t>כשתרצו לבנות סדרת הודעות אוטומטית (נרצ'ר)</w:t>
       </w:r>
     </w:p>
     <w:p>
@@ -5451,7 +5451,7 @@
           <w:sz w:val="24"/>
           <w:szCs w:val="24"/>
         </w:rPr>
-        <w:t xml:space="preserve">כשתרצי לראות נתוני פתיחה ולחיצה מפורטים</w:t>
+        <w:t>כשתרצו לראות נתוני פתיחה ולחיצה מפורטים</w:t>
       </w:r>
     </w:p>
     <w:p>
@@ -5570,7 +5570,7 @@
                 <w:sz w:val="22"/>
                 <w:szCs w:val="22"/>
               </w:rPr>
-              <w:t xml:space="preserve">שדרגי רק כשהביזנס צומח ויש ROI ברור.</w:t>
+              <w:t>שדרגו רק כשהביזנס צומח ויש ROI ברור.</w:t>
             </w:r>
           </w:p>
         </w:tc>
@@ -5667,7 +5667,7 @@
           <w:sz w:val="24"/>
           <w:szCs w:val="24"/>
         </w:rPr>
-        <w:t xml:space="preserve">וודאי שה-Flow במצב Active (לא Draft)</w:t>
+        <w:t>וודאו שה-Flow במצב Active (לא Draft)</w:t>
       </w:r>
     </w:p>
     <w:p>
@@ -5685,7 +5685,7 @@
           <w:sz w:val="24"/>
           <w:szCs w:val="24"/>
         </w:rPr>
-        <w:t xml:space="preserve">וודאי שהפוסט חובר ל-Flow ב-Comment Growth Tool</w:t>
+        <w:t>וודאו שהפוסט חובר ל-Flow ב-Comment Growth Tool</w:t>
       </w:r>
     </w:p>
     <w:p>
@@ -5703,7 +5703,7 @@
           <w:sz w:val="24"/>
           <w:szCs w:val="24"/>
         </w:rPr>
-        <w:t xml:space="preserve">בדקי שמילת המפתח בתגובה זהה בדיוק (CLAUDE, לא claude)</w:t>
+        <w:t>בדקו שמילת המפתח בתגובה זהה בדיוק (CLAUDE, לא claude)</w:t>
       </w:r>
     </w:p>
     <w:p>
@@ -5721,7 +5721,7 @@
           <w:sz w:val="24"/>
           <w:szCs w:val="24"/>
         </w:rPr>
-        <w:t xml:space="preserve">אינסטגרם לפעמים עושה שינויים ב-API — בדקי שה-connection פעיל</w:t>
+        <w:t>אינסטגרם לפעמים עושה שינויים ב-API — בדקו שה-connection פעיל</w:t>
       </w:r>
     </w:p>
     <w:p>
@@ -5761,7 +5761,7 @@
           <w:sz w:val="24"/>
           <w:szCs w:val="24"/>
         </w:rPr>
-        <w:t xml:space="preserve">בדקי שהוספת את ה-Condition לפני ה-Send Message</w:t>
+        <w:t>בדקו שהוספת את ה-Condition לפני ה-Send Message</w:t>
       </w:r>
     </w:p>
     <w:p>
@@ -5779,7 +5779,7 @@
           <w:sz w:val="24"/>
           <w:szCs w:val="24"/>
         </w:rPr>
-        <w:t xml:space="preserve">וודאי שה-Condition מוגדר ל-Check if user is following (לא Subscribed)</w:t>
+        <w:t>וודאו שה-Condition מוגדר ל-Check if user is following (לא Subscribed)</w:t>
       </w:r>
     </w:p>
     <w:p>
@@ -5819,7 +5819,7 @@
           <w:sz w:val="24"/>
           <w:szCs w:val="24"/>
         </w:rPr>
-        <w:t xml:space="preserve">עברי ל-Facebook Business Manager וחברי מחדש את ה-Instagram</w:t>
+        <w:t>עברו ל-Facebook Business Manager וחברו מחדש את ה-Instagram</w:t>
       </w:r>
     </w:p>
     <w:p>
@@ -5837,7 +5837,7 @@
           <w:sz w:val="24"/>
           <w:szCs w:val="24"/>
         </w:rPr>
-        <w:t xml:space="preserve">וודאי שיש לך הרשאות Admin בעמוד הפייסבוק</w:t>
+        <w:t>וודאו שיש לך הרשאות Admin בעמוד הפייסבוק</w:t>
       </w:r>
     </w:p>
     <w:p>
@@ -5855,7 +5855,7 @@
           <w:sz w:val="24"/>
           <w:szCs w:val="24"/>
         </w:rPr>
-        <w:t xml:space="preserve">נסי לנתק ולחבר מחדש מ-ManyChat Settings &gt; Channels</w:t>
+        <w:t>נסו לנתק ולחבר מחדש מ-ManyChat Settings &gt; Channels</w:t>
       </w:r>
     </w:p>
     <w:p>
@@ -5895,7 +5895,7 @@
           <w:sz w:val="24"/>
           <w:szCs w:val="24"/>
         </w:rPr>
-        <w:t xml:space="preserve">שדרגי ל-Pro, או</w:t>
+        <w:t>שדרגו ל-Pro, או</w:t>
       </w:r>
     </w:p>
     <w:p>
@@ -5913,7 +5913,7 @@
           <w:sz w:val="24"/>
           <w:szCs w:val="24"/>
         </w:rPr>
-        <w:t xml:space="preserve">נקי contacts לא פעילים: Contacts &gt; Filter &gt; Last Interaction &gt; מחקי אלה שלא פתחו 90+ יום</w:t>
+        <w:t>נקו contacts לא פעילים: Contacts &gt; Filter &gt; Last Interaction &gt; מחקו אלה שלא פתחו 90+ יום</w:t>
       </w:r>
     </w:p>
     <w:p>
@@ -6189,7 +6189,7 @@
           <w:sz w:val="24"/>
           <w:szCs w:val="24"/>
         </w:rPr>
-        <w:t xml:space="preserve">הגדרתי הודעה לענף NO (תעקבי ואז הגיבי שוב)</w:t>
+        <w:t>הגדרתי הודעה לענף NO (תעקבו ואז הגיבו שוב)</w:t>
       </w:r>
     </w:p>
     <w:p>
@@ -6550,7 +6550,7 @@
                 <w:sz w:val="22"/>
                 <w:szCs w:val="22"/>
               </w:rPr>
-              <w:t xml:space="preserve">עקבי אחר ה-Analytics ב-ManyChat כדי לראות כמה Contacts נכנסו.</w:t>
+              <w:t>עקבו אחר ה-Analytics ב-ManyChat כדי לראות כמה Contacts נכנסו.</w:t>
             </w:r>
           </w:p>
         </w:tc>

</xml_diff>